<commit_message>
Saved hotels on the server, per-IP limit on sign-in codes, partner app redesign, reports
</commit_message>
<xml_diff>
--- a/docs/BookDan-Backend-Scenario-Handling.docx
+++ b/docs/BookDan-Backend-Scenario-Handling.docx
@@ -56,7 +56,7 @@
           <w:sz w:val="20"/>
           <w:szCs w:val="20"/>
         </w:rPr>
-        <w:t xml:space="preserve">Repository state: 27 October 2026. Go 1.26, PostgreSQL (Supabase), 33 migrations, 107 HTTP routes, 229 test functions.</w:t>
+        <w:t xml:space="preserve">Repository state: 29 October 2026. Go 1.26, PostgreSQL (Supabase), 37 migrations, 131 HTTP routes, 253 test functions.</w:t>
       </w:r>
     </w:p>
     <w:p>
@@ -1423,7 +1423,7 @@
                 <w:sz w:val="18"/>
                 <w:szCs w:val="18"/>
               </w:rPr>
-              <w:t xml:space="preserve">bookings_guard also rejects any change to currency, base, service, vat, total, deposit, balance or rooms.</w:t>
+              <w:t xml:space="preserve">bookings_guard rejects any change to currency or rooms, and to base, service, vat, total, deposit or balance unless the transaction first sets app.reprice = on (00036), which only the date-change code does, together with a new price the guest confirmed.</w:t>
             </w:r>
           </w:p>
         </w:tc>
@@ -1455,7 +1455,7 @@
                 <w:sz w:val="18"/>
                 <w:szCs w:val="18"/>
               </w:rPr>
-              <w:t xml:space="preserve">Price drift after the hold.</w:t>
+              <w:t xml:space="preserve">Price drift after the hold; accidental repricing.</w:t>
             </w:r>
           </w:p>
         </w:tc>
@@ -1833,7 +1833,7 @@
                 <w:sz w:val="18"/>
                 <w:szCs w:val="18"/>
               </w:rPr>
-              <w:t xml:space="preserve">UNIQUE index payments_one_pending_per_booking and payments_one_success_per_booking (partial indexes); UNIQUE(provider, provider_ref) (00005).</w:t>
+              <w:t xml:space="preserve">UNIQUE indexes payments_one_pending_per_booking and payments_one_success_per_booking, now per (booking_id, kind) with kind booking or date_change (partial indexes, 00036); UNIQUE(provider, provider_ref) (00005).</w:t>
             </w:r>
           </w:p>
         </w:tc>
@@ -1865,7 +1865,7 @@
                 <w:sz w:val="18"/>
                 <w:szCs w:val="18"/>
               </w:rPr>
-              <w:t xml:space="preserve">Double charge; two successes for one booking.</w:t>
+              <w:t xml:space="preserve">Double charge; two successes for one booking (a date-change difference is a separate kind, at most one).</w:t>
             </w:r>
           </w:p>
         </w:tc>
@@ -3527,7 +3527,7 @@
                 <w:sz w:val="18"/>
                 <w:szCs w:val="18"/>
               </w:rPr>
-              <w:t xml:space="preserve">Identity normalised (phone to +251..., email lower-case). Counts otp_challenges for the identifier in the last 10 min; 5 or more returns 429. Random 6-digit code from crypto/rand; only HMAC hash stored (label "otp:"+identifier), 5 min expiry, client IP stored. Sent via the channel-routed OTPSender.</w:t>
+              <w:t xml:space="preserve">Identity normalised (phone to +251..., email lower-case). Counts otp_challenges per client address (OTP_MAX_PER_IP, default 30 in 10 minutes, so one connection cannot ask for codes for many addresses; generous because many people share one mobile-network address; indexed on otp_challenges.ip) and for the identifier in the last 10 min; 5 or more returns 429. Random 6-digit code from crypto/rand; only HMAC hash stored (label "otp:"+identifier), 5 min expiry, client IP stored. Sent via the channel-routed OTPSender.</w:t>
             </w:r>
           </w:p>
         </w:tc>
@@ -4142,7 +4142,7 @@
                 <w:sz w:val="18"/>
                 <w:szCs w:val="18"/>
               </w:rPr>
-              <w:t xml:space="preserve">POST /admin/login: email must be in ADMIN_EMAILS and password equal to ADMIN_PASSWORD (SHA-256 then constant-time compare; both checks always run). In-memory limiter: 8 tries / 10 min per ip+email. Upserts a users row with role admin, audit entry admin_login, 8 h token with no refresh. Optional owner portal via OTP when ADMIN_OWNERS=true and real codes are on.</w:t>
+              <w:t xml:space="preserve">adminLogin: the person's own admin_accounts row if they have one (disabled and locked states checked, password verified with PBKDF2-SHA256 at 600,000 rounds in constant time, a dummy hash is spent for unknown addresses so timing does not reveal them, five wrong passwords or codes lock the row for 15 min in the database). A TOTP second step (RFC 6238, HMAC-SHA1, 30 s steps, one step of drift) is required when enabled; the matched step is stored (totp_last_step) so a code works once, also under concurrent requests. Otherwise the shared ADMIN_PASSWORD for an email in ADMIN_EMAILS acts as a super admin only while that email has no account. Token 8 h with claims role=admin and ar=super|support|finance; an in-memory limiter per ip+email (8 tries / 10 min) sits in front.</w:t>
             </w:r>
           </w:p>
         </w:tc>
@@ -4174,7 +4174,212 @@
                 <w:sz w:val="18"/>
                 <w:szCs w:val="18"/>
               </w:rPr>
-              <w:t xml:space="preserve">Single shared password and per-process limiter are called out in 11.</w:t>
+              <w:t xml:space="preserve">Failed sign-ins are audited (admin_login_failed). Secrets are sealed with the same AEAD as ID numbers.</w:t>
+            </w:r>
+          </w:p>
+        </w:tc>
+      </w:tr>
+      <w:tr>
+        <w:trPr>
+          <w:cantSplit/>
+        </w:trPr>
+        <w:tc>
+          <w:tcPr>
+            <w:tcW w:type="dxa" w:w="1900"/>
+            <w:tcBorders>
+              <w:top w:val="single" w:color="BFBFBF" w:sz="4"/>
+              <w:left w:val="single" w:color="BFBFBF" w:sz="4"/>
+              <w:bottom w:val="single" w:color="BFBFBF" w:sz="4"/>
+              <w:right w:val="single" w:color="BFBFBF" w:sz="4"/>
+            </w:tcBorders>
+            <w:shd w:fill="F2F2F2" w:color="auto" w:val="clear"/>
+            <w:tcMar>
+              <w:top w:type="dxa" w:w="50"/>
+              <w:left w:type="dxa" w:w="90"/>
+              <w:bottom w:type="dxa" w:w="50"/>
+              <w:right w:type="dxa" w:w="90"/>
+            </w:tcMar>
+          </w:tcPr>
+          <w:p>
+            <w:pPr>
+              <w:spacing w:after="30"/>
+            </w:pPr>
+            <w:r>
+              <w:rPr>
+                <w:rFonts w:ascii="Calibri" w:cs="Calibri" w:eastAsia="Calibri" w:hAnsi="Calibri"/>
+                <w:b/>
+                <w:bCs/>
+                <w:sz w:val="18"/>
+                <w:szCs w:val="18"/>
+              </w:rPr>
+              <w:t xml:space="preserve">Admin roles and live checks</w:t>
+            </w:r>
+          </w:p>
+        </w:tc>
+        <w:tc>
+          <w:tcPr>
+            <w:tcW w:type="dxa" w:w="4200"/>
+            <w:tcBorders>
+              <w:top w:val="single" w:color="BFBFBF" w:sz="4"/>
+              <w:left w:val="single" w:color="BFBFBF" w:sz="4"/>
+              <w:bottom w:val="single" w:color="BFBFBF" w:sz="4"/>
+              <w:right w:val="single" w:color="BFBFBF" w:sz="4"/>
+            </w:tcBorders>
+            <w:shd w:fill="F2F2F2" w:color="auto" w:val="clear"/>
+            <w:tcMar>
+              <w:top w:type="dxa" w:w="50"/>
+              <w:left w:type="dxa" w:w="90"/>
+              <w:bottom w:type="dxa" w:w="50"/>
+              <w:right w:type="dxa" w:w="90"/>
+            </w:tcMar>
+          </w:tcPr>
+          <w:p>
+            <w:pPr>
+              <w:spacing w:after="30"/>
+            </w:pPr>
+            <w:r>
+              <w:rPr>
+                <w:rFonts w:ascii="Calibri" w:cs="Calibri" w:eastAsia="Calibri" w:hAnsi="Calibri"/>
+                <w:b w:val="false"/>
+                <w:bCs w:val="false"/>
+                <w:sz w:val="18"/>
+                <w:szCs w:val="18"/>
+              </w:rPr>
+              <w:t xml:space="preserve">adminGate runs after token verification on every admin request: the account must still exist and be enabled, its role must equal the token's ar claim (a role change ends the session), the password must not have changed after the token was issued (password_changed_at), and a bootstrap session needs its email still listed and the shared password still set. A must_change_password account may only call /admin/me and /admin/me/password. s.allow(roles...) wraps each route group (super everything; support: tickets, disputes, refunds, relocations, reviews; finance: payouts, receipts, statements, payment issues, rates, payout reveal); hotel owners pass the role check and are limited by canManage in the handlers.</w:t>
+            </w:r>
+          </w:p>
+        </w:tc>
+        <w:tc>
+          <w:tcPr>
+            <w:tcW w:type="dxa" w:w="2926"/>
+            <w:tcBorders>
+              <w:top w:val="single" w:color="BFBFBF" w:sz="4"/>
+              <w:left w:val="single" w:color="BFBFBF" w:sz="4"/>
+              <w:bottom w:val="single" w:color="BFBFBF" w:sz="4"/>
+              <w:right w:val="single" w:color="BFBFBF" w:sz="4"/>
+            </w:tcBorders>
+            <w:shd w:fill="F2F2F2" w:color="auto" w:val="clear"/>
+            <w:tcMar>
+              <w:top w:type="dxa" w:w="50"/>
+              <w:left w:type="dxa" w:w="90"/>
+              <w:bottom w:type="dxa" w:w="50"/>
+              <w:right w:type="dxa" w:w="90"/>
+            </w:tcMar>
+          </w:tcPr>
+          <w:p>
+            <w:pPr>
+              <w:spacing w:after="30"/>
+            </w:pPr>
+            <w:r>
+              <w:rPr>
+                <w:rFonts w:ascii="Calibri" w:cs="Calibri" w:eastAsia="Calibri" w:hAnsi="Calibri"/>
+                <w:b w:val="false"/>
+                <w:bCs w:val="false"/>
+                <w:sz w:val="18"/>
+                <w:szCs w:val="18"/>
+              </w:rPr>
+              <w:t xml:space="preserve">Disabling an admin takes effect on their next request. A route table test (TestAdminRolesLimitWhatEachPersonCanDo) probes 20 routes x 3 roles.</w:t>
+            </w:r>
+          </w:p>
+        </w:tc>
+      </w:tr>
+      <w:tr>
+        <w:trPr>
+          <w:cantSplit/>
+        </w:trPr>
+        <w:tc>
+          <w:tcPr>
+            <w:tcW w:type="dxa" w:w="1900"/>
+            <w:tcBorders>
+              <w:top w:val="single" w:color="BFBFBF" w:sz="4"/>
+              <w:left w:val="single" w:color="BFBFBF" w:sz="4"/>
+              <w:bottom w:val="single" w:color="BFBFBF" w:sz="4"/>
+              <w:right w:val="single" w:color="BFBFBF" w:sz="4"/>
+            </w:tcBorders>
+            <w:tcMar>
+              <w:top w:type="dxa" w:w="50"/>
+              <w:left w:type="dxa" w:w="90"/>
+              <w:bottom w:type="dxa" w:w="50"/>
+              <w:right w:type="dxa" w:w="90"/>
+            </w:tcMar>
+          </w:tcPr>
+          <w:p>
+            <w:pPr>
+              <w:spacing w:after="30"/>
+            </w:pPr>
+            <w:r>
+              <w:rPr>
+                <w:rFonts w:ascii="Calibri" w:cs="Calibri" w:eastAsia="Calibri" w:hAnsi="Calibri"/>
+                <w:b/>
+                <w:bCs/>
+                <w:sz w:val="18"/>
+                <w:szCs w:val="18"/>
+              </w:rPr>
+              <w:t xml:space="preserve">Managing admins (super only)</w:t>
+            </w:r>
+          </w:p>
+        </w:tc>
+        <w:tc>
+          <w:tcPr>
+            <w:tcW w:type="dxa" w:w="4200"/>
+            <w:tcBorders>
+              <w:top w:val="single" w:color="BFBFBF" w:sz="4"/>
+              <w:left w:val="single" w:color="BFBFBF" w:sz="4"/>
+              <w:bottom w:val="single" w:color="BFBFBF" w:sz="4"/>
+              <w:right w:val="single" w:color="BFBFBF" w:sz="4"/>
+            </w:tcBorders>
+            <w:tcMar>
+              <w:top w:type="dxa" w:w="50"/>
+              <w:left w:type="dxa" w:w="90"/>
+              <w:bottom w:type="dxa" w:w="50"/>
+              <w:right w:type="dxa" w:w="90"/>
+            </w:tcMar>
+          </w:tcPr>
+          <w:p>
+            <w:pPr>
+              <w:spacing w:after="30"/>
+            </w:pPr>
+            <w:r>
+              <w:rPr>
+                <w:rFonts w:ascii="Calibri" w:cs="Calibri" w:eastAsia="Calibri" w:hAnsi="Calibri"/>
+                <w:b w:val="false"/>
+                <w:bCs w:val="false"/>
+                <w:sz w:val="18"/>
+                <w:szCs w:val="18"/>
+              </w:rPr>
+              <w:t xml:space="preserve">POST /admin/admins creates a user (role admin; an address belonging to a guest or hotel account is refused) and the account with a generated 16-character temporary password shown once; PUT /admin/admins/{id} changes role, disables/enables, unlocks (the super rows are locked first, so two admins cannot remove each other as the last super; nobody can change their own role or disable themselves); reset-password generates a new temporary password and ends sessions; reset-mfa removes a lost authenticator. All audited.</w:t>
+            </w:r>
+          </w:p>
+        </w:tc>
+        <w:tc>
+          <w:tcPr>
+            <w:tcW w:type="dxa" w:w="2926"/>
+            <w:tcBorders>
+              <w:top w:val="single" w:color="BFBFBF" w:sz="4"/>
+              <w:left w:val="single" w:color="BFBFBF" w:sz="4"/>
+              <w:bottom w:val="single" w:color="BFBFBF" w:sz="4"/>
+              <w:right w:val="single" w:color="BFBFBF" w:sz="4"/>
+            </w:tcBorders>
+            <w:tcMar>
+              <w:top w:type="dxa" w:w="50"/>
+              <w:left w:type="dxa" w:w="90"/>
+              <w:bottom w:type="dxa" w:w="50"/>
+              <w:right w:type="dxa" w:w="90"/>
+            </w:tcMar>
+          </w:tcPr>
+          <w:p>
+            <w:pPr>
+              <w:spacing w:after="30"/>
+            </w:pPr>
+            <w:r>
+              <w:rPr>
+                <w:rFonts w:ascii="Calibri" w:cs="Calibri" w:eastAsia="Calibri" w:hAnsi="Calibri"/>
+                <w:b w:val="false"/>
+                <w:bCs w:val="false"/>
+                <w:sz w:val="18"/>
+                <w:szCs w:val="18"/>
+              </w:rPr>
+              <w:t xml:space="preserve">Own password change (POST /admin/me/password) needs the current password, enforces 12+ characters, returns a fresh token.</w:t>
             </w:r>
           </w:p>
         </w:tc>
@@ -4866,6 +5071,108 @@
                 <w:sz w:val="18"/>
                 <w:szCs w:val="18"/>
               </w:rPr>
+              <w:t xml:space="preserve">Saved hotels (wishlist)</w:t>
+            </w:r>
+          </w:p>
+        </w:tc>
+        <w:tc>
+          <w:tcPr>
+            <w:tcW w:type="dxa" w:w="4200"/>
+            <w:tcBorders>
+              <w:top w:val="single" w:color="BFBFBF" w:sz="4"/>
+              <w:left w:val="single" w:color="BFBFBF" w:sz="4"/>
+              <w:bottom w:val="single" w:color="BFBFBF" w:sz="4"/>
+              <w:right w:val="single" w:color="BFBFBF" w:sz="4"/>
+            </w:tcBorders>
+            <w:tcMar>
+              <w:top w:type="dxa" w:w="50"/>
+              <w:left w:type="dxa" w:w="90"/>
+              <w:bottom w:type="dxa" w:w="50"/>
+              <w:right w:type="dxa" w:w="90"/>
+            </w:tcMar>
+          </w:tcPr>
+          <w:p>
+            <w:pPr>
+              <w:spacing w:after="30"/>
+            </w:pPr>
+            <w:r>
+              <w:rPr>
+                <w:rFonts w:ascii="Calibri" w:cs="Calibri" w:eastAsia="Calibri" w:hAnsi="Calibri"/>
+                <w:b w:val="false"/>
+                <w:bCs w:val="false"/>
+                <w:sz w:val="18"/>
+                <w:szCs w:val="18"/>
+              </w:rPr>
+              <w:t xml:space="preserve">saved_properties(user_id, property_id) kept per guest (00037). GET /me/saved lists; PUT/DELETE /me/saved/{propertyId} save or remove one (idempotent; only published hotels can be saved; at most 200); POST /me/saved/sync {add, remove} applies what changed on the phone in one tx (a hotel in both lists is removed, unknown ids are ignored) and returns the whole list. The app keeps its own copy for offline use and merges the server's list in after each sync. Part of the data export; deleted with the account.</w:t>
+            </w:r>
+          </w:p>
+        </w:tc>
+        <w:tc>
+          <w:tcPr>
+            <w:tcW w:type="dxa" w:w="2926"/>
+            <w:tcBorders>
+              <w:top w:val="single" w:color="BFBFBF" w:sz="4"/>
+              <w:left w:val="single" w:color="BFBFBF" w:sz="4"/>
+              <w:bottom w:val="single" w:color="BFBFBF" w:sz="4"/>
+              <w:right w:val="single" w:color="BFBFBF" w:sz="4"/>
+            </w:tcBorders>
+            <w:tcMar>
+              <w:top w:type="dxa" w:w="50"/>
+              <w:left w:type="dxa" w:w="90"/>
+              <w:bottom w:type="dxa" w:w="50"/>
+              <w:right w:type="dxa" w:w="90"/>
+            </w:tcMar>
+          </w:tcPr>
+          <w:p>
+            <w:pPr>
+              <w:spacing w:after="30"/>
+            </w:pPr>
+            <w:r>
+              <w:rPr>
+                <w:rFonts w:ascii="Calibri" w:cs="Calibri" w:eastAsia="Calibri" w:hAnsi="Calibri"/>
+                <w:b w:val="false"/>
+                <w:bCs w:val="false"/>
+                <w:sz w:val="18"/>
+                <w:szCs w:val="18"/>
+              </w:rPr>
+              <w:t xml:space="preserve">The phone remembers removals until the server has them, so an offline removal does not come back.</w:t>
+            </w:r>
+          </w:p>
+        </w:tc>
+      </w:tr>
+      <w:tr>
+        <w:trPr>
+          <w:cantSplit/>
+        </w:trPr>
+        <w:tc>
+          <w:tcPr>
+            <w:tcW w:type="dxa" w:w="1900"/>
+            <w:tcBorders>
+              <w:top w:val="single" w:color="BFBFBF" w:sz="4"/>
+              <w:left w:val="single" w:color="BFBFBF" w:sz="4"/>
+              <w:bottom w:val="single" w:color="BFBFBF" w:sz="4"/>
+              <w:right w:val="single" w:color="BFBFBF" w:sz="4"/>
+            </w:tcBorders>
+            <w:shd w:fill="F2F2F2" w:color="auto" w:val="clear"/>
+            <w:tcMar>
+              <w:top w:type="dxa" w:w="50"/>
+              <w:left w:type="dxa" w:w="90"/>
+              <w:bottom w:type="dxa" w:w="50"/>
+              <w:right w:type="dxa" w:w="90"/>
+            </w:tcMar>
+          </w:tcPr>
+          <w:p>
+            <w:pPr>
+              <w:spacing w:after="30"/>
+            </w:pPr>
+            <w:r>
+              <w:rPr>
+                <w:rFonts w:ascii="Calibri" w:cs="Calibri" w:eastAsia="Calibri" w:hAnsi="Calibri"/>
+                <w:b/>
+                <w:bCs/>
+                <w:sz w:val="18"/>
+                <w:szCs w:val="18"/>
+              </w:rPr>
               <w:t xml:space="preserve">Pricing options</w:t>
             </w:r>
           </w:p>
@@ -4879,6 +5186,7 @@
               <w:bottom w:val="single" w:color="BFBFBF" w:sz="4"/>
               <w:right w:val="single" w:color="BFBFBF" w:sz="4"/>
             </w:tcBorders>
+            <w:shd w:fill="F2F2F2" w:color="auto" w:val="clear"/>
             <w:tcMar>
               <w:top w:type="dxa" w:w="50"/>
               <w:left w:type="dxa" w:w="90"/>
@@ -4911,6 +5219,7 @@
               <w:bottom w:val="single" w:color="BFBFBF" w:sz="4"/>
               <w:right w:val="single" w:color="BFBFBF" w:sz="4"/>
             </w:tcBorders>
+            <w:shd w:fill="F2F2F2" w:color="auto" w:val="clear"/>
             <w:tcMar>
               <w:top w:type="dxa" w:w="50"/>
               <w:left w:type="dxa" w:w="90"/>
@@ -11169,7 +11478,7 @@
         <w:rPr>
           <w:rFonts w:ascii="Calibri" w:cs="Calibri" w:eastAsia="Calibri" w:hAnsi="Calibri"/>
         </w:rPr>
-        <w:t xml:space="preserve">5.13 Change of dates (datechange.go)</w:t>
+        <w:t xml:space="preserve">5.13 Change of dates, including a different price (datechange.go)</w:t>
       </w:r>
     </w:p>
     <w:tbl>
@@ -11328,7 +11637,7 @@
                 <w:sz w:val="18"/>
                 <w:szCs w:val="18"/>
               </w:rPr>
-              <w:t xml:space="preserve">Eligibility</w:t>
+              <w:t xml:space="preserve">Eligibility (quote and apply)</w:t>
             </w:r>
           </w:p>
         </w:tc>
@@ -11360,7 +11669,7 @@
                 <w:sz w:val="18"/>
                 <w:szCs w:val="18"/>
               </w:rPr>
-              <w:t xml:space="preserve">Booking CONFIRMED, refundable, no coupon, never moved before; old and new check-in both more than 48 h away; same room type; new price identical in every component (base, service, VAT, total, deposit) else PRICE_DIFFERS with the new price.</w:t>
+              <w:t xml:space="preserve">loadMoving locks the booking FOR UPDATE: CONFIRMED, refundable, no coupon, never moved (date_changes &lt; 1), no waiting request (CHANGE_PENDING), old check-in more than 48 h away; planDateChange adds: new dates differ, new check-in more than 48 h away, same currency, and free rooms on the nights the booking does not have yet (nights it already has are not counted twice when ranges overlap).</w:t>
             </w:r>
           </w:p>
         </w:tc>
@@ -11392,7 +11701,7 @@
                 <w:sz w:val="18"/>
                 <w:szCs w:val="18"/>
               </w:rPr>
-              <w:t xml:space="preserve">All checked under the booking lock.</w:t>
+              <w:t xml:space="preserve">POST .../change-dates/quote runs the same code and changes nothing.</w:t>
             </w:r>
           </w:p>
         </w:tc>
@@ -11430,7 +11739,7 @@
                 <w:sz w:val="18"/>
                 <w:szCs w:val="18"/>
               </w:rPr>
-              <w:t xml:space="preserve">Execution</w:t>
+              <w:t xml:space="preserve">Same price / paid at the hotel / balance-only change</w:t>
             </w:r>
           </w:p>
         </w:tc>
@@ -11463,7 +11772,7 @@
                 <w:sz w:val="18"/>
                 <w:szCs w:val="18"/>
               </w:rPr>
-              <w:t xml:space="preserve">bookRooms takes confirmed rooms on every new night (all or none, SOLD_OUT) then unbookRooms on the old nights; dates updated through a guarded path that keeps amounts; original_check_in/out stored; audit entry; hotel push and guest email.</w:t>
+              <w:t xml:space="preserve">moveRooms (add new-only nights with a capacity-guarded UPDATE, drop old-only nights) then repriceBooking: set_config(app.reprice, on, local) lets bookings_guard accept new amounts (currency and rooms stay locked), date_changes+1, original dates kept. No money moves.</w:t>
             </w:r>
           </w:p>
         </w:tc>
@@ -11496,7 +11805,7 @@
                 <w:sz w:val="18"/>
                 <w:szCs w:val="18"/>
               </w:rPr>
-              <w:t xml:space="preserve">If the new nights are short the whole tx rolls back and the old booking is untouched.</w:t>
+              <w:t xml:space="preserve">All or nothing in one tx; SOLD_OUT rolls everything back.</w:t>
             </w:r>
           </w:p>
         </w:tc>
@@ -11533,7 +11842,7 @@
                 <w:sz w:val="18"/>
                 <w:szCs w:val="18"/>
               </w:rPr>
-              <w:t xml:space="preserve">Not built</w:t>
+              <w:t xml:space="preserve">Cheaper</w:t>
             </w:r>
           </w:p>
         </w:tc>
@@ -11565,7 +11874,7 @@
                 <w:sz w:val="18"/>
                 <w:szCs w:val="18"/>
               </w:rPr>
-              <w:t xml:space="preserve">Different price (would need a second payment or partial refund).</w:t>
+              <w:t xml:space="preserve">Same as above, then partialRefund(payer hotel) for the deposit difference: the hotel share, commission and VAT are reversed in proportion (reverseShareOfConfirmed, rounding to the hotel share), one gateway refund via runPartialRefunds.</w:t>
             </w:r>
           </w:p>
         </w:tc>
@@ -11597,7 +11906,417 @@
                 <w:sz w:val="18"/>
                 <w:szCs w:val="18"/>
               </w:rPr>
-              <w:t xml:space="preserve">-</w:t>
+              <w:t xml:space="preserve">Refund runs after commit; retried until accepted.</w:t>
+            </w:r>
+          </w:p>
+        </w:tc>
+      </w:tr>
+      <w:tr>
+        <w:trPr>
+          <w:cantSplit/>
+        </w:trPr>
+        <w:tc>
+          <w:tcPr>
+            <w:tcW w:type="dxa" w:w="1900"/>
+            <w:tcBorders>
+              <w:top w:val="single" w:color="BFBFBF" w:sz="4"/>
+              <w:left w:val="single" w:color="BFBFBF" w:sz="4"/>
+              <w:bottom w:val="single" w:color="BFBFBF" w:sz="4"/>
+              <w:right w:val="single" w:color="BFBFBF" w:sz="4"/>
+            </w:tcBorders>
+            <w:shd w:fill="F2F2F2" w:color="auto" w:val="clear"/>
+            <w:tcMar>
+              <w:top w:type="dxa" w:w="50"/>
+              <w:left w:type="dxa" w:w="90"/>
+              <w:bottom w:type="dxa" w:w="50"/>
+              <w:right w:type="dxa" w:w="90"/>
+            </w:tcMar>
+          </w:tcPr>
+          <w:p>
+            <w:pPr>
+              <w:spacing w:after="30"/>
+            </w:pPr>
+            <w:r>
+              <w:rPr>
+                <w:rFonts w:ascii="Calibri" w:cs="Calibri" w:eastAsia="Calibri" w:hAnsi="Calibri"/>
+                <w:b/>
+                <w:bCs/>
+                <w:sz w:val="18"/>
+                <w:szCs w:val="18"/>
+              </w:rPr>
+              <w:t xml:space="preserve">Dearer: a second payment</w:t>
+            </w:r>
+          </w:p>
+        </w:tc>
+        <w:tc>
+          <w:tcPr>
+            <w:tcW w:type="dxa" w:w="4200"/>
+            <w:tcBorders>
+              <w:top w:val="single" w:color="BFBFBF" w:sz="4"/>
+              <w:left w:val="single" w:color="BFBFBF" w:sz="4"/>
+              <w:bottom w:val="single" w:color="BFBFBF" w:sz="4"/>
+              <w:right w:val="single" w:color="BFBFBF" w:sz="4"/>
+            </w:tcBorders>
+            <w:shd w:fill="F2F2F2" w:color="auto" w:val="clear"/>
+            <w:tcMar>
+              <w:top w:type="dxa" w:w="50"/>
+              <w:left w:type="dxa" w:w="90"/>
+              <w:bottom w:type="dxa" w:w="50"/>
+              <w:right w:type="dxa" w:w="90"/>
+            </w:tcMar>
+          </w:tcPr>
+          <w:p>
+            <w:pPr>
+              <w:spacing w:after="30"/>
+            </w:pPr>
+            <w:r>
+              <w:rPr>
+                <w:rFonts w:ascii="Calibri" w:cs="Calibri" w:eastAsia="Calibri" w:hAnsi="Calibri"/>
+                <w:b w:val="false"/>
+                <w:bCs w:val="false"/>
+                <w:sz w:val="18"/>
+                <w:szCs w:val="18"/>
+              </w:rPr>
+              <w:t xml:space="preserve">A date_change_requests row (pending, expires in 15 min, new amounts stored), the new-only nights held (inventory.held, so they cannot be sold away), and a payments row of kind date_change for the deposit difference through the same Gateway.CreateSession. payments uniqueness is now per (booking, kind). The booking itself does not move yet. The client must send confirm_total_santim equal to the new total (else PRICE_DIFFERS, which also keeps old app versions safe).</w:t>
+            </w:r>
+          </w:p>
+        </w:tc>
+        <w:tc>
+          <w:tcPr>
+            <w:tcW w:type="dxa" w:w="2926"/>
+            <w:tcBorders>
+              <w:top w:val="single" w:color="BFBFBF" w:sz="4"/>
+              <w:left w:val="single" w:color="BFBFBF" w:sz="4"/>
+              <w:bottom w:val="single" w:color="BFBFBF" w:sz="4"/>
+              <w:right w:val="single" w:color="BFBFBF" w:sz="4"/>
+            </w:tcBorders>
+            <w:shd w:fill="F2F2F2" w:color="auto" w:val="clear"/>
+            <w:tcMar>
+              <w:top w:type="dxa" w:w="50"/>
+              <w:left w:type="dxa" w:w="90"/>
+              <w:bottom w:type="dxa" w:w="50"/>
+              <w:right w:type="dxa" w:w="90"/>
+            </w:tcMar>
+          </w:tcPr>
+          <w:p>
+            <w:pPr>
+              <w:spacing w:after="30"/>
+            </w:pPr>
+            <w:r>
+              <w:rPr>
+                <w:rFonts w:ascii="Calibri" w:cs="Calibri" w:eastAsia="Calibri" w:hAnsi="Calibri"/>
+                <w:b w:val="false"/>
+                <w:bCs w:val="false"/>
+                <w:sz w:val="18"/>
+                <w:szCs w:val="18"/>
+              </w:rPr>
+              <w:t xml:space="preserve">One pending request per booking (partial unique index): concurrent requests produce exactly one winner (tested with 4 parallel calls).</w:t>
+            </w:r>
+          </w:p>
+        </w:tc>
+      </w:tr>
+      <w:tr>
+        <w:trPr>
+          <w:cantSplit/>
+        </w:trPr>
+        <w:tc>
+          <w:tcPr>
+            <w:tcW w:type="dxa" w:w="1900"/>
+            <w:tcBorders>
+              <w:top w:val="single" w:color="BFBFBF" w:sz="4"/>
+              <w:left w:val="single" w:color="BFBFBF" w:sz="4"/>
+              <w:bottom w:val="single" w:color="BFBFBF" w:sz="4"/>
+              <w:right w:val="single" w:color="BFBFBF" w:sz="4"/>
+            </w:tcBorders>
+            <w:tcMar>
+              <w:top w:type="dxa" w:w="50"/>
+              <w:left w:type="dxa" w:w="90"/>
+              <w:bottom w:type="dxa" w:w="50"/>
+              <w:right w:type="dxa" w:w="90"/>
+            </w:tcMar>
+          </w:tcPr>
+          <w:p>
+            <w:pPr>
+              <w:spacing w:after="30"/>
+            </w:pPr>
+            <w:r>
+              <w:rPr>
+                <w:rFonts w:ascii="Calibri" w:cs="Calibri" w:eastAsia="Calibri" w:hAnsi="Calibri"/>
+                <w:b/>
+                <w:bCs/>
+                <w:sz w:val="18"/>
+                <w:szCs w:val="18"/>
+              </w:rPr>
+              <w:t xml:space="preserve">The payment arrives</w:t>
+            </w:r>
+          </w:p>
+        </w:tc>
+        <w:tc>
+          <w:tcPr>
+            <w:tcW w:type="dxa" w:w="4200"/>
+            <w:tcBorders>
+              <w:top w:val="single" w:color="BFBFBF" w:sz="4"/>
+              <w:left w:val="single" w:color="BFBFBF" w:sz="4"/>
+              <w:bottom w:val="single" w:color="BFBFBF" w:sz="4"/>
+              <w:right w:val="single" w:color="BFBFBF" w:sz="4"/>
+            </w:tcBorders>
+            <w:tcMar>
+              <w:top w:type="dxa" w:w="50"/>
+              <w:left w:type="dxa" w:w="90"/>
+              <w:bottom w:type="dxa" w:w="50"/>
+              <w:right w:type="dxa" w:w="90"/>
+            </w:tcMar>
+          </w:tcPr>
+          <w:p>
+            <w:pPr>
+              <w:spacing w:after="30"/>
+            </w:pPr>
+            <w:r>
+              <w:rPr>
+                <w:rFonts w:ascii="Calibri" w:cs="Calibri" w:eastAsia="Calibri" w:hAnsi="Calibri"/>
+                <w:b w:val="false"/>
+                <w:bCs w:val="false"/>
+                <w:sz w:val="18"/>
+                <w:szCs w:val="18"/>
+              </w:rPr>
+              <w:t xml:space="preserve">processPaymentEvent routes a succeeded date_change payment to settleDateChangePayment (inside the same tx that locked payment and booking): if the request is pending and the booking still CONFIRMED and unmoved, held nights become booked, old-only nights are released, the booking is repriced, the extra money is booked through ledgerConfirmed (hotel share, commission, VAT on the difference), request applied, audit row. Hotel alert and guest email follow commit.</w:t>
+            </w:r>
+          </w:p>
+        </w:tc>
+        <w:tc>
+          <w:tcPr>
+            <w:tcW w:type="dxa" w:w="2926"/>
+            <w:tcBorders>
+              <w:top w:val="single" w:color="BFBFBF" w:sz="4"/>
+              <w:left w:val="single" w:color="BFBFBF" w:sz="4"/>
+              <w:bottom w:val="single" w:color="BFBFBF" w:sz="4"/>
+              <w:right w:val="single" w:color="BFBFBF" w:sz="4"/>
+            </w:tcBorders>
+            <w:tcMar>
+              <w:top w:type="dxa" w:w="50"/>
+              <w:left w:type="dxa" w:w="90"/>
+              <w:bottom w:type="dxa" w:w="50"/>
+              <w:right w:type="dxa" w:w="90"/>
+            </w:tcMar>
+          </w:tcPr>
+          <w:p>
+            <w:pPr>
+              <w:spacing w:after="30"/>
+            </w:pPr>
+            <w:r>
+              <w:rPr>
+                <w:rFonts w:ascii="Calibri" w:cs="Calibri" w:eastAsia="Calibri" w:hAnsi="Calibri"/>
+                <w:b w:val="false"/>
+                <w:bCs w:val="false"/>
+                <w:sz w:val="18"/>
+                <w:szCs w:val="18"/>
+              </w:rPr>
+              <w:t xml:space="preserve">Otherwise (request expired or cancelled, booking cancelled meanwhile) the request is marked refunded and accrueRefund owes the money back; runRefunds picks up date_change payments with no pending/applied request.</w:t>
+            </w:r>
+          </w:p>
+        </w:tc>
+      </w:tr>
+      <w:tr>
+        <w:trPr>
+          <w:cantSplit/>
+        </w:trPr>
+        <w:tc>
+          <w:tcPr>
+            <w:tcW w:type="dxa" w:w="1900"/>
+            <w:tcBorders>
+              <w:top w:val="single" w:color="BFBFBF" w:sz="4"/>
+              <w:left w:val="single" w:color="BFBFBF" w:sz="4"/>
+              <w:bottom w:val="single" w:color="BFBFBF" w:sz="4"/>
+              <w:right w:val="single" w:color="BFBFBF" w:sz="4"/>
+            </w:tcBorders>
+            <w:shd w:fill="F2F2F2" w:color="auto" w:val="clear"/>
+            <w:tcMar>
+              <w:top w:type="dxa" w:w="50"/>
+              <w:left w:type="dxa" w:w="90"/>
+              <w:bottom w:type="dxa" w:w="50"/>
+              <w:right w:type="dxa" w:w="90"/>
+            </w:tcMar>
+          </w:tcPr>
+          <w:p>
+            <w:pPr>
+              <w:spacing w:after="30"/>
+            </w:pPr>
+            <w:r>
+              <w:rPr>
+                <w:rFonts w:ascii="Calibri" w:cs="Calibri" w:eastAsia="Calibri" w:hAnsi="Calibri"/>
+                <w:b/>
+                <w:bCs/>
+                <w:sz w:val="18"/>
+                <w:szCs w:val="18"/>
+              </w:rPr>
+              <w:t xml:space="preserve">Not paid in time / guest drops it</w:t>
+            </w:r>
+          </w:p>
+        </w:tc>
+        <w:tc>
+          <w:tcPr>
+            <w:tcW w:type="dxa" w:w="4200"/>
+            <w:tcBorders>
+              <w:top w:val="single" w:color="BFBFBF" w:sz="4"/>
+              <w:left w:val="single" w:color="BFBFBF" w:sz="4"/>
+              <w:bottom w:val="single" w:color="BFBFBF" w:sz="4"/>
+              <w:right w:val="single" w:color="BFBFBF" w:sz="4"/>
+            </w:tcBorders>
+            <w:shd w:fill="F2F2F2" w:color="auto" w:val="clear"/>
+            <w:tcMar>
+              <w:top w:type="dxa" w:w="50"/>
+              <w:left w:type="dxa" w:w="90"/>
+              <w:bottom w:type="dxa" w:w="50"/>
+              <w:right w:type="dxa" w:w="90"/>
+            </w:tcMar>
+          </w:tcPr>
+          <w:p>
+            <w:pPr>
+              <w:spacing w:after="30"/>
+            </w:pPr>
+            <w:r>
+              <w:rPr>
+                <w:rFonts w:ascii="Calibri" w:cs="Calibri" w:eastAsia="Calibri" w:hAnsi="Calibri"/>
+                <w:b w:val="false"/>
+                <w:bCs w:val="false"/>
+                <w:sz w:val="18"/>
+                <w:szCs w:val="18"/>
+              </w:rPr>
+              <w:t xml:space="preserve">expireDateChanges (in sweep, FOR UPDATE SKIP LOCKED) releases the held nights and marks the request expired; the payment is left alone so lock order stays booking-side first and there is no deadlock with the payment path. POST .../change-dates/cancel and cancelling or hotel-cancelling the booking call abandonDateChange. POST .../change-dates/pay resumes (same page if still open, a new payment after a failure).</w:t>
+            </w:r>
+          </w:p>
+        </w:tc>
+        <w:tc>
+          <w:tcPr>
+            <w:tcW w:type="dxa" w:w="2926"/>
+            <w:tcBorders>
+              <w:top w:val="single" w:color="BFBFBF" w:sz="4"/>
+              <w:left w:val="single" w:color="BFBFBF" w:sz="4"/>
+              <w:bottom w:val="single" w:color="BFBFBF" w:sz="4"/>
+              <w:right w:val="single" w:color="BFBFBF" w:sz="4"/>
+            </w:tcBorders>
+            <w:shd w:fill="F2F2F2" w:color="auto" w:val="clear"/>
+            <w:tcMar>
+              <w:top w:type="dxa" w:w="50"/>
+              <w:left w:type="dxa" w:w="90"/>
+              <w:bottom w:type="dxa" w:w="50"/>
+              <w:right w:type="dxa" w:w="90"/>
+            </w:tcMar>
+          </w:tcPr>
+          <w:p>
+            <w:pPr>
+              <w:spacing w:after="30"/>
+            </w:pPr>
+            <w:r>
+              <w:rPr>
+                <w:rFonts w:ascii="Calibri" w:cs="Calibri" w:eastAsia="Calibri" w:hAnsi="Calibri"/>
+                <w:b w:val="false"/>
+                <w:bCs w:val="false"/>
+                <w:sz w:val="18"/>
+                <w:szCs w:val="18"/>
+              </w:rPr>
+              <w:t xml:space="preserve">A payment that still succeeds later is refunded automatically (tested).</w:t>
+            </w:r>
+          </w:p>
+        </w:tc>
+      </w:tr>
+      <w:tr>
+        <w:trPr>
+          <w:cantSplit/>
+        </w:trPr>
+        <w:tc>
+          <w:tcPr>
+            <w:tcW w:type="dxa" w:w="1900"/>
+            <w:tcBorders>
+              <w:top w:val="single" w:color="BFBFBF" w:sz="4"/>
+              <w:left w:val="single" w:color="BFBFBF" w:sz="4"/>
+              <w:bottom w:val="single" w:color="BFBFBF" w:sz="4"/>
+              <w:right w:val="single" w:color="BFBFBF" w:sz="4"/>
+            </w:tcBorders>
+            <w:tcMar>
+              <w:top w:type="dxa" w:w="50"/>
+              <w:left w:type="dxa" w:w="90"/>
+              <w:bottom w:type="dxa" w:w="50"/>
+              <w:right w:type="dxa" w:w="90"/>
+            </w:tcMar>
+          </w:tcPr>
+          <w:p>
+            <w:pPr>
+              <w:spacing w:after="30"/>
+            </w:pPr>
+            <w:r>
+              <w:rPr>
+                <w:rFonts w:ascii="Calibri" w:cs="Calibri" w:eastAsia="Calibri" w:hAnsi="Calibri"/>
+                <w:b/>
+                <w:bCs/>
+                <w:sz w:val="18"/>
+                <w:szCs w:val="18"/>
+              </w:rPr>
+              <w:t xml:space="preserve">Refunds with two payments</w:t>
+            </w:r>
+          </w:p>
+        </w:tc>
+        <w:tc>
+          <w:tcPr>
+            <w:tcW w:type="dxa" w:w="4200"/>
+            <w:tcBorders>
+              <w:top w:val="single" w:color="BFBFBF" w:sz="4"/>
+              <w:left w:val="single" w:color="BFBFBF" w:sz="4"/>
+              <w:bottom w:val="single" w:color="BFBFBF" w:sz="4"/>
+              <w:right w:val="single" w:color="BFBFBF" w:sz="4"/>
+            </w:tcBorders>
+            <w:tcMar>
+              <w:top w:type="dxa" w:w="50"/>
+              <w:left w:type="dxa" w:w="90"/>
+              <w:bottom w:type="dxa" w:w="50"/>
+              <w:right w:type="dxa" w:w="90"/>
+            </w:tcMar>
+          </w:tcPr>
+          <w:p>
+            <w:pPr>
+              <w:spacing w:after="30"/>
+            </w:pPr>
+            <w:r>
+              <w:rPr>
+                <w:rFonts w:ascii="Calibri" w:cs="Calibri" w:eastAsia="Calibri" w:hAnsi="Calibri"/>
+                <w:b w:val="false"/>
+                <w:bCs w:val="false"/>
+                <w:sz w:val="18"/>
+                <w:szCs w:val="18"/>
+              </w:rPr>
+              <w:t xml:space="preserve">lockRefundable now returns the total paid and what is left across all succeeded payments (locked FOR UPDATE, main payment first); a cancellation or dispute refund returns everything left, and runRefunds refunds each payment by its own provider reference; a partial refund is drawn from one payment that has enough left. reverseConfirmedAndOweRefund uses the booking's total paid, so the reversal covers both confirmation entries.</w:t>
+            </w:r>
+          </w:p>
+        </w:tc>
+        <w:tc>
+          <w:tcPr>
+            <w:tcW w:type="dxa" w:w="2926"/>
+            <w:tcBorders>
+              <w:top w:val="single" w:color="BFBFBF" w:sz="4"/>
+              <w:left w:val="single" w:color="BFBFBF" w:sz="4"/>
+              <w:bottom w:val="single" w:color="BFBFBF" w:sz="4"/>
+              <w:right w:val="single" w:color="BFBFBF" w:sz="4"/>
+            </w:tcBorders>
+            <w:tcMar>
+              <w:top w:type="dxa" w:w="50"/>
+              <w:left w:type="dxa" w:w="90"/>
+              <w:bottom w:type="dxa" w:w="50"/>
+              <w:right w:type="dxa" w:w="90"/>
+            </w:tcMar>
+          </w:tcPr>
+          <w:p>
+            <w:pPr>
+              <w:spacing w:after="30"/>
+            </w:pPr>
+            <w:r>
+              <w:rPr>
+                <w:rFonts w:ascii="Calibri" w:cs="Calibri" w:eastAsia="Calibri" w:hAnsi="Calibri"/>
+                <w:b w:val="false"/>
+                <w:bCs w:val="false"/>
+                <w:sz w:val="18"/>
+                <w:szCs w:val="18"/>
+              </w:rPr>
+              <w:t xml:space="preserve">After a dearer move and a cancel every ledger account nets to zero and both payments are refunded (tested).</w:t>
             </w:r>
           </w:p>
         </w:tc>
@@ -12562,7 +13281,7 @@
                 <w:sz w:val="18"/>
                 <w:szCs w:val="18"/>
               </w:rPr>
-              <w:t xml:space="preserve">mailSupport emails admins and SUPPORT_EMAIL on new tickets and replies; mailGuestAnswer emails the guest (phone-only guests see it in the app).</w:t>
+              <w:t xml:space="preserve">notifyTicketOwner (called by every path that answers a ticket: admin reply, dispute decision, goodwill refund, relocation settlement) pushes to the ticket owner's devices (app guest, or partner for a hotel ticket; the title names the request, never the answer) with data {type: support_answer, ticket_id} so the app opens the thread, and emails the owner when they have an address. mailSupport emails admins and SUPPORT_EMAIL on new tickets and replies.</w:t>
             </w:r>
           </w:p>
         </w:tc>
@@ -12595,7 +13314,7 @@
                 <w:sz w:val="18"/>
                 <w:szCs w:val="18"/>
               </w:rPr>
-              <w:t xml:space="preserve">Never fails the action.</w:t>
+              <w:t xml:space="preserve">Push and mail failures are logged and never fail the answer; a ticket owner with no registered phone is not an error.</w:t>
             </w:r>
           </w:p>
         </w:tc>
@@ -13151,6 +13870,107 @@
           </w:p>
         </w:tc>
       </w:tr>
+      <w:tr>
+        <w:trPr>
+          <w:cantSplit/>
+        </w:trPr>
+        <w:tc>
+          <w:tcPr>
+            <w:tcW w:type="dxa" w:w="1900"/>
+            <w:tcBorders>
+              <w:top w:val="single" w:color="BFBFBF" w:sz="4"/>
+              <w:left w:val="single" w:color="BFBFBF" w:sz="4"/>
+              <w:bottom w:val="single" w:color="BFBFBF" w:sz="4"/>
+              <w:right w:val="single" w:color="BFBFBF" w:sz="4"/>
+            </w:tcBorders>
+            <w:tcMar>
+              <w:top w:type="dxa" w:w="50"/>
+              <w:left w:type="dxa" w:w="90"/>
+              <w:bottom w:type="dxa" w:w="50"/>
+              <w:right w:type="dxa" w:w="90"/>
+            </w:tcMar>
+          </w:tcPr>
+          <w:p>
+            <w:pPr>
+              <w:spacing w:after="30"/>
+            </w:pPr>
+            <w:r>
+              <w:rPr>
+                <w:rFonts w:ascii="Calibri" w:cs="Calibri" w:eastAsia="Calibri" w:hAnsi="Calibri"/>
+                <w:b/>
+                <w:bCs/>
+                <w:sz w:val="18"/>
+                <w:szCs w:val="18"/>
+              </w:rPr>
+              <w:t xml:space="preserve">Moderation (admin: super or support)</w:t>
+            </w:r>
+          </w:p>
+        </w:tc>
+        <w:tc>
+          <w:tcPr>
+            <w:tcW w:type="dxa" w:w="4200"/>
+            <w:tcBorders>
+              <w:top w:val="single" w:color="BFBFBF" w:sz="4"/>
+              <w:left w:val="single" w:color="BFBFBF" w:sz="4"/>
+              <w:bottom w:val="single" w:color="BFBFBF" w:sz="4"/>
+              <w:right w:val="single" w:color="BFBFBF" w:sz="4"/>
+            </w:tcBorders>
+            <w:tcMar>
+              <w:top w:type="dxa" w:w="50"/>
+              <w:left w:type="dxa" w:w="90"/>
+              <w:bottom w:type="dxa" w:w="50"/>
+              <w:right w:type="dxa" w:w="90"/>
+            </w:tcMar>
+          </w:tcPr>
+          <w:p>
+            <w:pPr>
+              <w:spacing w:after="30"/>
+            </w:pPr>
+            <w:r>
+              <w:rPr>
+                <w:rFonts w:ascii="Calibri" w:cs="Calibri" w:eastAsia="Calibri" w:hAnsi="Calibri"/>
+                <w:b w:val="false"/>
+                <w:bCs w:val="false"/>
+                <w:sz w:val="18"/>
+                <w:szCs w:val="18"/>
+              </w:rPr>
+              <w:t xml:space="preserve">GET /admin/reviews (status visible|hidden|all, hotel, q, sort lowest|latest, 100 rows), POST /admin/reviews/{id}/hide {reason 3-300 chars}, POST .../restore. Hiding sets hidden_at/hidden_by/hidden_reason (CHECK keeps the three together); the property_ratings view and ratingSummary filter hidden_at IS NULL, the public review list and the owner's list exclude hidden rows, and replying to a hidden review is a 404. The author still sees their own review on their booking. Audit actions review_hidden / review_restored.</w:t>
+            </w:r>
+          </w:p>
+        </w:tc>
+        <w:tc>
+          <w:tcPr>
+            <w:tcW w:type="dxa" w:w="2926"/>
+            <w:tcBorders>
+              <w:top w:val="single" w:color="BFBFBF" w:sz="4"/>
+              <w:left w:val="single" w:color="BFBFBF" w:sz="4"/>
+              <w:bottom w:val="single" w:color="BFBFBF" w:sz="4"/>
+              <w:right w:val="single" w:color="BFBFBF" w:sz="4"/>
+            </w:tcBorders>
+            <w:tcMar>
+              <w:top w:type="dxa" w:w="50"/>
+              <w:left w:type="dxa" w:w="90"/>
+              <w:bottom w:type="dxa" w:w="50"/>
+              <w:right w:type="dxa" w:w="90"/>
+            </w:tcMar>
+          </w:tcPr>
+          <w:p>
+            <w:pPr>
+              <w:spacing w:after="30"/>
+            </w:pPr>
+            <w:r>
+              <w:rPr>
+                <w:rFonts w:ascii="Calibri" w:cs="Calibri" w:eastAsia="Calibri" w:hAnsi="Calibri"/>
+                <w:b w:val="false"/>
+                <w:bCs w:val="false"/>
+                <w:sz w:val="18"/>
+                <w:szCs w:val="18"/>
+              </w:rPr>
+              <w:t xml:space="preserve">Row locked FOR UPDATE; hiding twice or restoring a visible one is 409. Tested end to end (public page, rating count, owner list, reply, audit).</w:t>
+            </w:r>
+          </w:p>
+        </w:tc>
+      </w:tr>
     </w:tbl>
     <w:p>
       <w:pPr>
@@ -15142,7 +15962,7 @@
                 <w:sz w:val="18"/>
                 <w:szCs w:val="18"/>
               </w:rPr>
-              <w:t xml:space="preserve">Default 0 (off) unless RATE_LIMIT_*_PER_MIN is set; per instance; trusts RealIP headers (11).</w:t>
+              <w:t xml:space="preserve">Production defaults 600 reads / 60 writes per minute when the environment leaves them unset; off in development and tests; per instance; trusts RealIP headers (11).</w:t>
             </w:r>
           </w:p>
         </w:tc>
@@ -15468,7 +16288,7 @@
         <w:rPr>
           <w:rFonts w:ascii="Calibri" w:cs="Calibri" w:eastAsia="Calibri" w:hAnsi="Calibri"/>
         </w:rPr>
-        <w:t xml:space="preserve">6. Endpoint inventory (107 routes)</w:t>
+        <w:t xml:space="preserve">6. Endpoint inventory (131 routes)</w:t>
       </w:r>
     </w:p>
     <w:tbl>
@@ -15695,7 +16515,7 @@
                 <w:sz w:val="18"/>
                 <w:szCs w:val="18"/>
               </w:rPr>
-              <w:t xml:space="preserve">POST /quotes, /bookings; GET /bookings, /bookings/{id}; POST /bookings/{id}/pay, /cancel, /review, /dispute, /change-dates, /call; GET /bookings/{id}/voucher; PUT /me/devices/push-token; GET/PUT/DELETE /me/profile; DELETE /me/account; GET /me/export; POST/GET /support/tickets, GET /support/tickets/{id}, POST /support/tickets/{id}/messages, /close</w:t>
+              <w:t xml:space="preserve">POST /quotes, /bookings; GET /bookings, /bookings/{id}; POST /bookings/{id}/pay, /cancel, /review, /dispute, /change-dates, /change-dates/quote, /change-dates/pay, /change-dates/cancel, /call; GET /bookings/{id}/voucher; PUT /me/devices/push-token; GET/PUT/DELETE /me/profile; DELETE /me/account; GET /me/export; POST/GET /support/tickets, GET /support/tickets/{id}, POST /support/tickets/{id}/messages, /close</w:t>
             </w:r>
           </w:p>
         </w:tc>
@@ -15835,7 +16655,7 @@
                 <w:sz w:val="18"/>
                 <w:szCs w:val="18"/>
               </w:rPr>
-              <w:t xml:space="preserve">POST /admin/login, /admin/otp/request, /admin/otp/verify; GET /admin/config, /me, /hotels, /hotels/{id}, /coupons, /payouts, /support/tickets, /support/tickets/{id}, /applications, /analytics, /calls, /rates, /payment-issues, /hotels/{id}/statements, /hotels/{id}/payouts; POST/PUT hotels, rooms, prices, photos, business, payout reveal, coupons, ticket reply/close/resolve/refund/relocation, application approve/reject, rates, payment-issue resolve, receipts, payouts, alerts, staff add/remove</w:t>
+              <w:t xml:space="preserve">POST /admin/login, /admin/otp/request, /admin/otp/verify; GET /admin/config, /me, /hotels, /hotels/{id}, /coupons, /payouts, /support/tickets, /support/tickets/{id}, /applications, /analytics, /calls, /rates, /payment-issues, /hotels/{id}/statements, /hotels/{id}/payouts; POST /admin/reviews/{id}/hide and /restore, POST /admin/admins, PUT /admin/admins/{id}, POST /admin/admins/{id}/reset-password and /reset-mfa, POST /admin/me/password and /me/mfa/setup, /enable, /disable; POST/PUT hotels, rooms, prices, photos, business, payout reveal, coupons, ticket reply/close/resolve/refund/relocation, application approve/reject, rates, payment-issue resolve, receipts, payouts, alerts, staff add/remove</w:t>
             </w:r>
           </w:p>
         </w:tc>
@@ -16124,7 +16944,7 @@
                 <w:sz w:val="18"/>
                 <w:szCs w:val="18"/>
               </w:rPr>
-              <w:t xml:space="preserve">stepAlerts (escalations and reminders); expire holds; decline unanswered requests; runRefunds; notify guests of no-response</w:t>
+              <w:t xml:space="preserve">stepAlerts (escalations and reminders); end date-change requests whose payment did not arrive (release their held nights); expire holds; decline unanswered requests; runRefunds; notify guests of no-response</w:t>
             </w:r>
           </w:p>
         </w:tc>
@@ -18406,7 +19226,7 @@
                 <w:sz w:val="18"/>
                 <w:szCs w:val="18"/>
               </w:rPr>
-              <w:t xml:space="preserve">In-memory fixed window per process, per client IP from RealIP headers; default 0 (off) unless env is set; sign-in code requests are limited per identifier only, not per IP.</w:t>
+              <w:t xml:space="preserve">In-memory fixed window per process and per client IP from RealIP headers (production defaults 600 reads and 60 writes per minute, off in development and tests). Sign-in codes are limited per identifier and, in the database, per client address (OTP_MAX_PER_IP, default 30 per 10 minutes). Still open: the in-memory windows are per instance and only as honest as the proxy headers.</w:t>
             </w:r>
           </w:p>
         </w:tc>
@@ -18439,7 +19259,7 @@
                 <w:sz w:val="18"/>
                 <w:szCs w:val="18"/>
               </w:rPr>
-              <w:t xml:space="preserve">Edge/shared limiter (Redis or provider) and per-IP OTP limits before launch.</w:t>
+              <w:t xml:space="preserve">Edge or shared limiter (Redis or the host provider) before running several instances.</w:t>
             </w:r>
           </w:p>
         </w:tc>
@@ -18540,7 +19360,7 @@
                 <w:sz w:val="18"/>
                 <w:szCs w:val="18"/>
               </w:rPr>
-              <w:t xml:space="preserve">One shared ADMIN_PASSWORD for all platform admins, in-memory login limiter, 8 h token with no refresh/revocation list, no MFA, no separate roles (support/finance).</w:t>
+              <w:t xml:space="preserve">Per-admin accounts (PBKDF2-SHA256, 600,000 rounds), three roles enforced per route and re-checked against the database on every request, DB-backed lockout (5 failures, 15 min), optional TOTP second step with replay protection. Still open: the first-time shared ADMIN_PASSWORD remains as a bootstrap path until removed from the environment; no recovery codes for the second step (a super admin resets it); the 8 h token is not refreshable; the sign-in limiter per ip+email is in memory.</w:t>
             </w:r>
           </w:p>
         </w:tc>
@@ -18572,7 +19392,7 @@
                 <w:sz w:val="18"/>
                 <w:szCs w:val="18"/>
               </w:rPr>
-              <w:t xml:space="preserve">Per-admin credentials with MFA, scoped roles, revocable sessions.</w:t>
+              <w:t xml:space="preserve">Is TOTP optional enough? Make it mandatory for super and finance? Add recovery codes?</w:t>
             </w:r>
           </w:p>
         </w:tc>
@@ -19016,7 +19836,7 @@
                 <w:sz w:val="18"/>
                 <w:szCs w:val="18"/>
               </w:rPr>
-              <w:t xml:space="preserve">11</w:t>
+              <w:t xml:space="preserve">12</w:t>
             </w:r>
           </w:p>
         </w:tc>
@@ -19048,7 +19868,7 @@
                 <w:sz w:val="18"/>
                 <w:szCs w:val="18"/>
               </w:rPr>
-              <w:t xml:space="preserve">Date change with a price difference</w:t>
+              <w:t xml:space="preserve">Partial-refund on Chapa</w:t>
             </w:r>
           </w:p>
         </w:tc>
@@ -19080,7 +19900,7 @@
                 <w:sz w:val="18"/>
                 <w:szCs w:val="18"/>
               </w:rPr>
-              <w:t xml:space="preserve">Refused; would need a second payment or partial refund.</w:t>
+              <w:t xml:space="preserve">Tested only against a fake of Chapa's v2 refunds endpoint.</w:t>
             </w:r>
           </w:p>
         </w:tc>
@@ -19112,7 +19932,7 @@
                 <w:sz w:val="18"/>
                 <w:szCs w:val="18"/>
               </w:rPr>
-              <w:t xml:space="preserve">Design the supplement payment as a child of the booking?</w:t>
+              <w:t xml:space="preserve">One real small partial refund before relying on it.</w:t>
             </w:r>
           </w:p>
         </w:tc>
@@ -19150,7 +19970,7 @@
                 <w:sz w:val="18"/>
                 <w:szCs w:val="18"/>
               </w:rPr>
-              <w:t xml:space="preserve">12</w:t>
+              <w:t xml:space="preserve">13</w:t>
             </w:r>
           </w:p>
         </w:tc>
@@ -19183,7 +20003,7 @@
                 <w:sz w:val="18"/>
                 <w:szCs w:val="18"/>
               </w:rPr>
-              <w:t xml:space="preserve">Partial-refund on Chapa</w:t>
+              <w:t xml:space="preserve">Test/production divergence</w:t>
             </w:r>
           </w:p>
         </w:tc>
@@ -19216,7 +20036,7 @@
                 <w:sz w:val="18"/>
                 <w:szCs w:val="18"/>
               </w:rPr>
-              <w:t xml:space="preserve">Tested only against a fake of Chapa's v2 refunds endpoint.</w:t>
+              <w:t xml:space="preserve">Tests run without PostGIS and on a WIN1252 database (non-Latin search test skipped); production uses PostGIS and UTF-8.</w:t>
             </w:r>
           </w:p>
         </w:tc>
@@ -19249,7 +20069,7 @@
                 <w:sz w:val="18"/>
                 <w:szCs w:val="18"/>
               </w:rPr>
-              <w:t xml:space="preserve">One real small partial refund before relying on it.</w:t>
+              <w:t xml:space="preserve">Run the suite against a Supabase-like Postgres image with PostGIS, UTF-8.</w:t>
             </w:r>
           </w:p>
         </w:tc>
@@ -19286,7 +20106,7 @@
                 <w:sz w:val="18"/>
                 <w:szCs w:val="18"/>
               </w:rPr>
-              <w:t xml:space="preserve">13</w:t>
+              <w:t xml:space="preserve">14</w:t>
             </w:r>
           </w:p>
         </w:tc>
@@ -19318,7 +20138,7 @@
                 <w:sz w:val="18"/>
                 <w:szCs w:val="18"/>
               </w:rPr>
-              <w:t xml:space="preserve">Test/production divergence</w:t>
+              <w:t xml:space="preserve">Analytics</w:t>
             </w:r>
           </w:p>
         </w:tc>
@@ -19350,7 +20170,7 @@
                 <w:sz w:val="18"/>
                 <w:szCs w:val="18"/>
               </w:rPr>
-              <w:t xml:space="preserve">Tests run without PostGIS and on a WIN1252 database (non-Latin search test skipped); production uses PostGIS and UTF-8.</w:t>
+              <w:t xml:space="preserve">Computed live from OLTP tables on each request; no caching or read replica.</w:t>
             </w:r>
           </w:p>
         </w:tc>
@@ -19382,7 +20202,7 @@
                 <w:sz w:val="18"/>
                 <w:szCs w:val="18"/>
               </w:rPr>
-              <w:t xml:space="preserve">Run the suite against a Supabase-like Postgres image with PostGIS, UTF-8.</w:t>
+              <w:t xml:space="preserve">Materialised/rollup tables when volume grows.</w:t>
             </w:r>
           </w:p>
         </w:tc>
@@ -19420,7 +20240,7 @@
                 <w:sz w:val="18"/>
                 <w:szCs w:val="18"/>
               </w:rPr>
-              <w:t xml:space="preserve">14</w:t>
+              <w:t xml:space="preserve">15</w:t>
             </w:r>
           </w:p>
         </w:tc>
@@ -19453,7 +20273,7 @@
                 <w:sz w:val="18"/>
                 <w:szCs w:val="18"/>
               </w:rPr>
-              <w:t xml:space="preserve">Analytics</w:t>
+              <w:t xml:space="preserve">ID number handling</w:t>
             </w:r>
           </w:p>
         </w:tc>
@@ -19486,7 +20306,7 @@
                 <w:sz w:val="18"/>
                 <w:szCs w:val="18"/>
               </w:rPr>
-              <w:t xml:space="preserve">Computed live from OLTP tables on each request; no caching or read replica.</w:t>
+              <w:t xml:space="preserve">AES-GCM with a key from env, HMAC hash for matching, retention erasure job off until a legal period is chosen; booking_guests copy retains name after account deletion.</w:t>
             </w:r>
           </w:p>
         </w:tc>
@@ -19519,7 +20339,7 @@
                 <w:sz w:val="18"/>
                 <w:szCs w:val="18"/>
               </w:rPr>
-              <w:t xml:space="preserve">Materialised/rollup tables when volume grows.</w:t>
+              <w:t xml:space="preserve">Key rotation strategy (envelope keys, key id in ciphertext)?</w:t>
             </w:r>
           </w:p>
         </w:tc>
@@ -19556,7 +20376,7 @@
                 <w:sz w:val="18"/>
                 <w:szCs w:val="18"/>
               </w:rPr>
-              <w:t xml:space="preserve">15</w:t>
+              <w:t xml:space="preserve">16</w:t>
             </w:r>
           </w:p>
         </w:tc>
@@ -19588,7 +20408,7 @@
                 <w:sz w:val="18"/>
                 <w:szCs w:val="18"/>
               </w:rPr>
-              <w:t xml:space="preserve">ID number handling</w:t>
+              <w:t xml:space="preserve">Phone and email identities not mergeable</w:t>
             </w:r>
           </w:p>
         </w:tc>
@@ -19620,7 +20440,7 @@
                 <w:sz w:val="18"/>
                 <w:szCs w:val="18"/>
               </w:rPr>
-              <w:t xml:space="preserve">AES-GCM with a key from env, HMAC hash for matching, retention erasure job off until a legal period is chosen; booking_guests copy retains name after account deletion.</w:t>
+              <w:t xml:space="preserve">Same person can hold two accounts.</w:t>
             </w:r>
           </w:p>
         </w:tc>
@@ -19652,7 +20472,7 @@
                 <w:sz w:val="18"/>
                 <w:szCs w:val="18"/>
               </w:rPr>
-              <w:t xml:space="preserve">Key rotation strategy (envelope keys, key id in ciphertext)?</w:t>
+              <w:t xml:space="preserve">Merge flow or phone-only/email-only policy?</w:t>
             </w:r>
           </w:p>
         </w:tc>
@@ -19690,7 +20510,7 @@
                 <w:sz w:val="18"/>
                 <w:szCs w:val="18"/>
               </w:rPr>
-              <w:t xml:space="preserve">16</w:t>
+              <w:t xml:space="preserve">17</w:t>
             </w:r>
           </w:p>
         </w:tc>
@@ -19723,7 +20543,7 @@
                 <w:sz w:val="18"/>
                 <w:szCs w:val="18"/>
               </w:rPr>
-              <w:t xml:space="preserve">Phone and email identities not mergeable</w:t>
+              <w:t xml:space="preserve">Observability</w:t>
             </w:r>
           </w:p>
         </w:tc>
@@ -19756,7 +20576,7 @@
                 <w:sz w:val="18"/>
                 <w:szCs w:val="18"/>
               </w:rPr>
-              <w:t xml:space="preserve">Same person can hold two accounts.</w:t>
+              <w:t xml:space="preserve">Structured request logs and operator alerts exist; no metrics, tracing or error tracking inside the phone apps; no backups restore test yet.</w:t>
             </w:r>
           </w:p>
         </w:tc>
@@ -19789,7 +20609,7 @@
                 <w:sz w:val="18"/>
                 <w:szCs w:val="18"/>
               </w:rPr>
-              <w:t xml:space="preserve">Merge flow or phone-only/email-only policy?</w:t>
+              <w:t xml:space="preserve">Prometheus/OpenTelemetry, Sentry, PITR drill.</w:t>
             </w:r>
           </w:p>
         </w:tc>
@@ -19826,7 +20646,7 @@
                 <w:sz w:val="18"/>
                 <w:szCs w:val="18"/>
               </w:rPr>
-              <w:t xml:space="preserve">17</w:t>
+              <w:t xml:space="preserve">18</w:t>
             </w:r>
           </w:p>
         </w:tc>
@@ -19858,7 +20678,7 @@
                 <w:sz w:val="18"/>
                 <w:szCs w:val="18"/>
               </w:rPr>
-              <w:t xml:space="preserve">Observability</w:t>
+              <w:t xml:space="preserve">Pagination coverage</w:t>
             </w:r>
           </w:p>
         </w:tc>
@@ -19890,7 +20710,7 @@
                 <w:sz w:val="18"/>
                 <w:szCs w:val="18"/>
               </w:rPr>
-              <w:t xml:space="preserve">Structured request logs and operator alerts exist; no metrics, tracing or error tracking inside the phone apps; no backups restore test yet.</w:t>
+              <w:t xml:space="preserve">Guest and hotel booking lists are keyset-paged; several admin lists (tickets, applications, payment issues, hotels) are bounded but not paged.</w:t>
             </w:r>
           </w:p>
         </w:tc>
@@ -19903,143 +20723,6 @@
               <w:bottom w:val="single" w:color="BFBFBF" w:sz="4"/>
               <w:right w:val="single" w:color="BFBFBF" w:sz="4"/>
             </w:tcBorders>
-            <w:tcMar>
-              <w:top w:type="dxa" w:w="50"/>
-              <w:left w:type="dxa" w:w="90"/>
-              <w:bottom w:type="dxa" w:w="50"/>
-              <w:right w:type="dxa" w:w="90"/>
-            </w:tcMar>
-          </w:tcPr>
-          <w:p>
-            <w:pPr>
-              <w:spacing w:after="30"/>
-            </w:pPr>
-            <w:r>
-              <w:rPr>
-                <w:rFonts w:ascii="Calibri" w:cs="Calibri" w:eastAsia="Calibri" w:hAnsi="Calibri"/>
-                <w:b w:val="false"/>
-                <w:bCs w:val="false"/>
-                <w:sz w:val="18"/>
-                <w:szCs w:val="18"/>
-              </w:rPr>
-              <w:t xml:space="preserve">Prometheus/OpenTelemetry, Sentry, PITR drill.</w:t>
-            </w:r>
-          </w:p>
-        </w:tc>
-      </w:tr>
-      <w:tr>
-        <w:trPr>
-          <w:cantSplit/>
-        </w:trPr>
-        <w:tc>
-          <w:tcPr>
-            <w:tcW w:type="dxa" w:w="400"/>
-            <w:tcBorders>
-              <w:top w:val="single" w:color="BFBFBF" w:sz="4"/>
-              <w:left w:val="single" w:color="BFBFBF" w:sz="4"/>
-              <w:bottom w:val="single" w:color="BFBFBF" w:sz="4"/>
-              <w:right w:val="single" w:color="BFBFBF" w:sz="4"/>
-            </w:tcBorders>
-            <w:shd w:fill="F2F2F2" w:color="auto" w:val="clear"/>
-            <w:tcMar>
-              <w:top w:type="dxa" w:w="50"/>
-              <w:left w:type="dxa" w:w="90"/>
-              <w:bottom w:type="dxa" w:w="50"/>
-              <w:right w:type="dxa" w:w="90"/>
-            </w:tcMar>
-          </w:tcPr>
-          <w:p>
-            <w:pPr>
-              <w:spacing w:after="30"/>
-            </w:pPr>
-            <w:r>
-              <w:rPr>
-                <w:rFonts w:ascii="Calibri" w:cs="Calibri" w:eastAsia="Calibri" w:hAnsi="Calibri"/>
-                <w:b/>
-                <w:bCs/>
-                <w:sz w:val="18"/>
-                <w:szCs w:val="18"/>
-              </w:rPr>
-              <w:t xml:space="preserve">18</w:t>
-            </w:r>
-          </w:p>
-        </w:tc>
-        <w:tc>
-          <w:tcPr>
-            <w:tcW w:type="dxa" w:w="1900"/>
-            <w:tcBorders>
-              <w:top w:val="single" w:color="BFBFBF" w:sz="4"/>
-              <w:left w:val="single" w:color="BFBFBF" w:sz="4"/>
-              <w:bottom w:val="single" w:color="BFBFBF" w:sz="4"/>
-              <w:right w:val="single" w:color="BFBFBF" w:sz="4"/>
-            </w:tcBorders>
-            <w:shd w:fill="F2F2F2" w:color="auto" w:val="clear"/>
-            <w:tcMar>
-              <w:top w:type="dxa" w:w="50"/>
-              <w:left w:type="dxa" w:w="90"/>
-              <w:bottom w:type="dxa" w:w="50"/>
-              <w:right w:type="dxa" w:w="90"/>
-            </w:tcMar>
-          </w:tcPr>
-          <w:p>
-            <w:pPr>
-              <w:spacing w:after="30"/>
-            </w:pPr>
-            <w:r>
-              <w:rPr>
-                <w:rFonts w:ascii="Calibri" w:cs="Calibri" w:eastAsia="Calibri" w:hAnsi="Calibri"/>
-                <w:b w:val="false"/>
-                <w:bCs w:val="false"/>
-                <w:sz w:val="18"/>
-                <w:szCs w:val="18"/>
-              </w:rPr>
-              <w:t xml:space="preserve">Pagination coverage</w:t>
-            </w:r>
-          </w:p>
-        </w:tc>
-        <w:tc>
-          <w:tcPr>
-            <w:tcW w:type="dxa" w:w="3726"/>
-            <w:tcBorders>
-              <w:top w:val="single" w:color="BFBFBF" w:sz="4"/>
-              <w:left w:val="single" w:color="BFBFBF" w:sz="4"/>
-              <w:bottom w:val="single" w:color="BFBFBF" w:sz="4"/>
-              <w:right w:val="single" w:color="BFBFBF" w:sz="4"/>
-            </w:tcBorders>
-            <w:shd w:fill="F2F2F2" w:color="auto" w:val="clear"/>
-            <w:tcMar>
-              <w:top w:type="dxa" w:w="50"/>
-              <w:left w:type="dxa" w:w="90"/>
-              <w:bottom w:type="dxa" w:w="50"/>
-              <w:right w:type="dxa" w:w="90"/>
-            </w:tcMar>
-          </w:tcPr>
-          <w:p>
-            <w:pPr>
-              <w:spacing w:after="30"/>
-            </w:pPr>
-            <w:r>
-              <w:rPr>
-                <w:rFonts w:ascii="Calibri" w:cs="Calibri" w:eastAsia="Calibri" w:hAnsi="Calibri"/>
-                <w:b w:val="false"/>
-                <w:bCs w:val="false"/>
-                <w:sz w:val="18"/>
-                <w:szCs w:val="18"/>
-              </w:rPr>
-              <w:t xml:space="preserve">Guest and hotel booking lists are keyset-paged; several admin lists (tickets, applications, payment issues, hotels) are bounded but not paged.</w:t>
-            </w:r>
-          </w:p>
-        </w:tc>
-        <w:tc>
-          <w:tcPr>
-            <w:tcW w:type="dxa" w:w="3000"/>
-            <w:tcBorders>
-              <w:top w:val="single" w:color="BFBFBF" w:sz="4"/>
-              <w:left w:val="single" w:color="BFBFBF" w:sz="4"/>
-              <w:bottom w:val="single" w:color="BFBFBF" w:sz="4"/>
-              <w:right w:val="single" w:color="BFBFBF" w:sz="4"/>
-            </w:tcBorders>
-            <w:shd w:fill="F2F2F2" w:color="auto" w:val="clear"/>
             <w:tcMar>
               <w:top w:type="dxa" w:w="50"/>
               <w:left w:type="dxa" w:w="90"/>

</xml_diff>